<commit_message>
Remove founder-led product sections from resume
</commit_message>
<xml_diff>
--- a/docs/downloads/bt-franklin-resume-full.docx
+++ b/docs/downloads/bt-franklin-resume-full.docx
@@ -963,39 +963,7 @@
           <w:color w:val="0C0C0C"/>
           <w:sz w:val="32"/>
         </w:rPr>
-        <w:t>Selected Founder-Led AI Products</w:t>
-      </w:r>
-    </w:p>
-    <w:p>
-      <w:pPr>
-        <w:keepNext/>
-        <w:spacing w:before="0" w:after="160"/>
-      </w:pPr>
-      <w:r>
-        <w:rPr>
-          <w:rFonts w:ascii="Helvetica Neue" w:hAnsi="Helvetica Neue" w:eastAsia="Helvetica Neue"/>
-          <w:b/>
-          <w:color w:val="0C0C0C"/>
-          <w:sz w:val="24"/>
-        </w:rPr>
-        <w:t>RepoZest</w:t>
-      </w:r>
-      <w:r>
-        <w:rPr>
-          <w:rFonts w:ascii="Helvetica Neue" w:hAnsi="Helvetica Neue" w:eastAsia="Helvetica Neue"/>
-          <w:color w:val="0C0C0C"/>
-          <w:sz w:val="24"/>
-        </w:rPr>
-        <w:t xml:space="preserve"> - </w:t>
-      </w:r>
-      <w:r>
-        <w:rPr>
-          <w:rFonts w:ascii="Helvetica Neue" w:hAnsi="Helvetica Neue" w:eastAsia="Helvetica Neue"/>
-          <w:i/>
-          <w:color w:val="0C0C0C"/>
-          <w:sz w:val="24"/>
-        </w:rPr>
-        <w:t>Founder / Product Architect, 2026</w:t>
+        <w:t>Selected Independent and Open Source AI Work</w:t>
       </w:r>
     </w:p>
     <w:p>
@@ -1027,694 +995,7 @@
           <w:color w:val="0C0C0C"/>
           <w:sz w:val="24"/>
         </w:rPr>
-        <w:t>Built and publicly deployed a solo GitHub App-backed repository intelligence SaaS, then sunset and open-sourced it after it did not gain customer traction.</w:t>
-      </w:r>
-    </w:p>
-    <w:p>
-      <w:pPr>
-        <w:pStyle w:val="ListBullet"/>
-        <w:keepLines/>
-        <w:numPr>
-          <w:numId w:val="0"/>
-        </w:numPr>
-        <w:tabs>
-          <w:tab w:pos="360" w:val="left"/>
-        </w:tabs>
-        <w:spacing w:before="0" w:after="160"/>
-        <w:ind w:left="360" w:hanging="360"/>
-      </w:pPr>
-      <w:r>
-        <w:rPr>
-          <w:rFonts w:ascii="Helvetica Neue" w:hAnsi="Helvetica Neue" w:eastAsia="Helvetica Neue"/>
-          <w:color w:val="0C0C0C"/>
-          <w:sz w:val="24"/>
-        </w:rPr>
-        <w:t>•</w:t>
-        <w:tab/>
-      </w:r>
-      <w:r>
-        <w:rPr>
-          <w:rFonts w:ascii="Helvetica Neue" w:hAnsi="Helvetica Neue" w:eastAsia="Helvetica Neue"/>
-          <w:i w:val="0"/>
-          <w:color w:val="0C0C0C"/>
-          <w:sz w:val="24"/>
-        </w:rPr>
-        <w:t>Designed a Django monolith with web, worker, and scheduler services, GitHub App authentication, repository indexing, AI artifacts, billing, and operator workflows.</w:t>
-      </w:r>
-    </w:p>
-    <w:p>
-      <w:pPr>
-        <w:pStyle w:val="ListBullet"/>
-        <w:keepLines/>
-        <w:numPr>
-          <w:numId w:val="0"/>
-        </w:numPr>
-        <w:tabs>
-          <w:tab w:pos="360" w:val="left"/>
-        </w:tabs>
-        <w:spacing w:before="0" w:after="160"/>
-        <w:ind w:left="360" w:hanging="360"/>
-      </w:pPr>
-      <w:r>
-        <w:rPr>
-          <w:rFonts w:ascii="Helvetica Neue" w:hAnsi="Helvetica Neue" w:eastAsia="Helvetica Neue"/>
-          <w:color w:val="0C0C0C"/>
-          <w:sz w:val="24"/>
-        </w:rPr>
-        <w:t>•</w:t>
-        <w:tab/>
-      </w:r>
-      <w:r>
-        <w:rPr>
-          <w:rFonts w:ascii="Helvetica Neue" w:hAnsi="Helvetica Neue" w:eastAsia="Helvetica Neue"/>
-          <w:i w:val="0"/>
-          <w:color w:val="0C0C0C"/>
-          <w:sz w:val="24"/>
-        </w:rPr>
-        <w:t>Built deterministic extraction across branch snapshots, file trees, source excerpts, commits, contributor aliases, pull requests, reviews, and path-level ownership facts.</w:t>
-      </w:r>
-    </w:p>
-    <w:p>
-      <w:pPr>
-        <w:pStyle w:val="ListBullet"/>
-        <w:keepLines/>
-        <w:numPr>
-          <w:numId w:val="0"/>
-        </w:numPr>
-        <w:tabs>
-          <w:tab w:pos="360" w:val="left"/>
-        </w:tabs>
-        <w:spacing w:before="0" w:after="160"/>
-        <w:ind w:left="360" w:hanging="360"/>
-      </w:pPr>
-      <w:r>
-        <w:rPr>
-          <w:rFonts w:ascii="Helvetica Neue" w:hAnsi="Helvetica Neue" w:eastAsia="Helvetica Neue"/>
-          <w:color w:val="0C0C0C"/>
-          <w:sz w:val="24"/>
-        </w:rPr>
-        <w:t>•</w:t>
-        <w:tab/>
-      </w:r>
-      <w:r>
-        <w:rPr>
-          <w:rFonts w:ascii="Helvetica Neue" w:hAnsi="Helvetica Neue" w:eastAsia="Helvetica Neue"/>
-          <w:i w:val="0"/>
-          <w:color w:val="0C0C0C"/>
-          <w:sz w:val="24"/>
-        </w:rPr>
-        <w:t>Derived architecture areas before mapping paths to semantic systems and grounding contributor expertise inference.</w:t>
-      </w:r>
-    </w:p>
-    <w:p>
-      <w:pPr>
-        <w:pStyle w:val="ListBullet"/>
-        <w:keepLines/>
-        <w:numPr>
-          <w:numId w:val="0"/>
-        </w:numPr>
-        <w:tabs>
-          <w:tab w:pos="360" w:val="left"/>
-        </w:tabs>
-        <w:spacing w:before="0" w:after="160"/>
-        <w:ind w:left="360" w:hanging="360"/>
-      </w:pPr>
-      <w:r>
-        <w:rPr>
-          <w:rFonts w:ascii="Helvetica Neue" w:hAnsi="Helvetica Neue" w:eastAsia="Helvetica Neue"/>
-          <w:color w:val="0C0C0C"/>
-          <w:sz w:val="24"/>
-        </w:rPr>
-        <w:t>•</w:t>
-        <w:tab/>
-      </w:r>
-      <w:r>
-        <w:rPr>
-          <w:rFonts w:ascii="Helvetica Neue" w:hAnsi="Helvetica Neue" w:eastAsia="Helvetica Neue"/>
-          <w:i w:val="0"/>
-          <w:color w:val="0C0C0C"/>
-          <w:sz w:val="24"/>
-        </w:rPr>
-        <w:t>Produced architecture and expertise reports, expert-routing suggestions, hotspot signals, maintenance pressure, and interactive answers from published expertise graphs.</w:t>
-      </w:r>
-    </w:p>
-    <w:p>
-      <w:pPr>
-        <w:pStyle w:val="ListBullet"/>
-        <w:keepLines/>
-        <w:numPr>
-          <w:numId w:val="0"/>
-        </w:numPr>
-        <w:tabs>
-          <w:tab w:pos="360" w:val="left"/>
-        </w:tabs>
-        <w:spacing w:before="0" w:after="160"/>
-        <w:ind w:left="360" w:hanging="360"/>
-      </w:pPr>
-      <w:r>
-        <w:rPr>
-          <w:rFonts w:ascii="Helvetica Neue" w:hAnsi="Helvetica Neue" w:eastAsia="Helvetica Neue"/>
-          <w:color w:val="0C0C0C"/>
-          <w:sz w:val="24"/>
-        </w:rPr>
-        <w:t>•</w:t>
-        <w:tab/>
-      </w:r>
-      <w:r>
-        <w:rPr>
-          <w:rFonts w:ascii="Helvetica Neue" w:hAnsi="Helvetica Neue" w:eastAsia="Helvetica Neue"/>
-          <w:i w:val="0"/>
-          <w:color w:val="0C0C0C"/>
-          <w:sz w:val="24"/>
-        </w:rPr>
-        <w:t>Focused the product on architecture visibility, current-team expert discovery, knowledge concentration, ownership fragility, and coordination risk.</w:t>
-      </w:r>
-    </w:p>
-    <w:p>
-      <w:pPr>
-        <w:pStyle w:val="ListBullet"/>
-        <w:keepLines/>
-        <w:numPr>
-          <w:numId w:val="0"/>
-        </w:numPr>
-        <w:tabs>
-          <w:tab w:pos="360" w:val="left"/>
-        </w:tabs>
-        <w:spacing w:before="0" w:after="160"/>
-        <w:ind w:left="360" w:hanging="360"/>
-      </w:pPr>
-      <w:r>
-        <w:rPr>
-          <w:rFonts w:ascii="Helvetica Neue" w:hAnsi="Helvetica Neue" w:eastAsia="Helvetica Neue"/>
-          <w:color w:val="0C0C0C"/>
-          <w:sz w:val="24"/>
-        </w:rPr>
-        <w:t>•</w:t>
-        <w:tab/>
-      </w:r>
-      <w:r>
-        <w:rPr>
-          <w:rFonts w:ascii="Helvetica Neue" w:hAnsi="Helvetica Neue" w:eastAsia="Helvetica Neue"/>
-          <w:i w:val="0"/>
-          <w:color w:val="0C0C0C"/>
-          <w:sz w:val="24"/>
-        </w:rPr>
-        <w:t>Built provider-neutral billing with Stripe-hosted payments, entitlement enforcement, trials, subscription normalization, and a future GitHub Marketplace adapter path.</w:t>
-      </w:r>
-    </w:p>
-    <w:p>
-      <w:pPr>
-        <w:pStyle w:val="ListBullet"/>
-        <w:keepLines/>
-        <w:numPr>
-          <w:numId w:val="0"/>
-        </w:numPr>
-        <w:tabs>
-          <w:tab w:pos="360" w:val="left"/>
-        </w:tabs>
-        <w:spacing w:before="0" w:after="160"/>
-        <w:ind w:left="360" w:hanging="360"/>
-      </w:pPr>
-      <w:r>
-        <w:rPr>
-          <w:rFonts w:ascii="Helvetica Neue" w:hAnsi="Helvetica Neue" w:eastAsia="Helvetica Neue"/>
-          <w:color w:val="0C0C0C"/>
-          <w:sz w:val="24"/>
-        </w:rPr>
-        <w:t>•</w:t>
-        <w:tab/>
-      </w:r>
-      <w:r>
-        <w:rPr>
-          <w:rFonts w:ascii="Helvetica Neue" w:hAnsi="Helvetica Neue" w:eastAsia="Helvetica Neue"/>
-          <w:i w:val="0"/>
-          <w:color w:val="0C0C0C"/>
-          <w:sz w:val="24"/>
-        </w:rPr>
-        <w:t>Created Terraform, GitHub Actions workflows, deployment manifests, helper scripts, and operator runbooks for Sevalla.</w:t>
-      </w:r>
-    </w:p>
-    <w:p>
-      <w:pPr>
-        <w:pStyle w:val="ListBullet"/>
-        <w:keepLines/>
-        <w:numPr>
-          <w:numId w:val="0"/>
-        </w:numPr>
-        <w:tabs>
-          <w:tab w:pos="360" w:val="left"/>
-        </w:tabs>
-        <w:spacing w:before="0" w:after="160"/>
-        <w:ind w:left="360" w:hanging="360"/>
-      </w:pPr>
-      <w:r>
-        <w:rPr>
-          <w:rFonts w:ascii="Helvetica Neue" w:hAnsi="Helvetica Neue" w:eastAsia="Helvetica Neue"/>
-          <w:color w:val="0C0C0C"/>
-          <w:sz w:val="24"/>
-        </w:rPr>
-        <w:t>•</w:t>
-        <w:tab/>
-      </w:r>
-      <w:r>
-        <w:rPr>
-          <w:rFonts w:ascii="Helvetica Neue" w:hAnsi="Helvetica Neue" w:eastAsia="Helvetica Neue"/>
-          <w:i w:val="0"/>
-          <w:color w:val="0C0C0C"/>
-          <w:sz w:val="24"/>
-        </w:rPr>
-        <w:t>Owned opportunity definition, product strategy, architecture, UX, AI pipelines, GitHub integration, billing, deployment, and go-to-market positioning.</w:t>
-      </w:r>
-    </w:p>
-    <w:p>
-      <w:pPr>
-        <w:keepNext/>
-        <w:spacing w:before="0" w:after="160"/>
-      </w:pPr>
-      <w:r>
-        <w:rPr>
-          <w:rFonts w:ascii="Helvetica Neue" w:hAnsi="Helvetica Neue" w:eastAsia="Helvetica Neue"/>
-          <w:b/>
-          <w:color w:val="0C0C0C"/>
-          <w:sz w:val="24"/>
-        </w:rPr>
-        <w:t>Hiredar</w:t>
-      </w:r>
-      <w:r>
-        <w:rPr>
-          <w:rFonts w:ascii="Helvetica Neue" w:hAnsi="Helvetica Neue" w:eastAsia="Helvetica Neue"/>
-          <w:color w:val="0C0C0C"/>
-          <w:sz w:val="24"/>
-        </w:rPr>
-        <w:t xml:space="preserve"> - </w:t>
-      </w:r>
-      <w:r>
-        <w:rPr>
-          <w:rFonts w:ascii="Helvetica Neue" w:hAnsi="Helvetica Neue" w:eastAsia="Helvetica Neue"/>
-          <w:i/>
-          <w:color w:val="0C0C0C"/>
-          <w:sz w:val="24"/>
-        </w:rPr>
-        <w:t>Founder / Product Architect, 2025</w:t>
-      </w:r>
-    </w:p>
-    <w:p>
-      <w:pPr>
-        <w:pStyle w:val="ListBullet"/>
-        <w:keepLines/>
-        <w:numPr>
-          <w:numId w:val="0"/>
-        </w:numPr>
-        <w:tabs>
-          <w:tab w:pos="360" w:val="left"/>
-        </w:tabs>
-        <w:spacing w:before="0" w:after="160"/>
-        <w:ind w:left="360" w:hanging="360"/>
-      </w:pPr>
-      <w:r>
-        <w:rPr>
-          <w:rFonts w:ascii="Helvetica Neue" w:hAnsi="Helvetica Neue" w:eastAsia="Helvetica Neue"/>
-          <w:color w:val="0C0C0C"/>
-          <w:sz w:val="24"/>
-        </w:rPr>
-        <w:t>•</w:t>
-        <w:tab/>
-      </w:r>
-      <w:r>
-        <w:rPr>
-          <w:rFonts w:ascii="Helvetica Neue" w:hAnsi="Helvetica Neue" w:eastAsia="Helvetica Neue"/>
-          <w:i w:val="0"/>
-          <w:color w:val="0C0C0C"/>
-          <w:sz w:val="24"/>
-        </w:rPr>
-        <w:t>Built and deployed a solo AI recruiting SaaS in roughly two months, accelerating product, engineering, UI, deployment, and go-to-market work with AI tools.</w:t>
-      </w:r>
-    </w:p>
-    <w:p>
-      <w:pPr>
-        <w:pStyle w:val="ListBullet"/>
-        <w:keepLines/>
-        <w:numPr>
-          <w:numId w:val="0"/>
-        </w:numPr>
-        <w:tabs>
-          <w:tab w:pos="360" w:val="left"/>
-        </w:tabs>
-        <w:spacing w:before="0" w:after="160"/>
-        <w:ind w:left="360" w:hanging="360"/>
-      </w:pPr>
-      <w:r>
-        <w:rPr>
-          <w:rFonts w:ascii="Helvetica Neue" w:hAnsi="Helvetica Neue" w:eastAsia="Helvetica Neue"/>
-          <w:color w:val="0C0C0C"/>
-          <w:sz w:val="24"/>
-        </w:rPr>
-        <w:t>•</w:t>
-        <w:tab/>
-      </w:r>
-      <w:r>
-        <w:rPr>
-          <w:rFonts w:ascii="Helvetica Neue" w:hAnsi="Helvetica Neue" w:eastAsia="Helvetica Neue"/>
-          <w:i w:val="0"/>
-          <w:color w:val="0C0C0C"/>
-          <w:sz w:val="24"/>
-        </w:rPr>
-        <w:t>Designed resume parsing, structured candidate extraction, and explainable candidate-to-role matching.</w:t>
-      </w:r>
-    </w:p>
-    <w:p>
-      <w:pPr>
-        <w:pStyle w:val="ListBullet"/>
-        <w:keepLines/>
-        <w:numPr>
-          <w:numId w:val="0"/>
-        </w:numPr>
-        <w:tabs>
-          <w:tab w:pos="360" w:val="left"/>
-        </w:tabs>
-        <w:spacing w:before="0" w:after="160"/>
-        <w:ind w:left="360" w:hanging="360"/>
-      </w:pPr>
-      <w:r>
-        <w:rPr>
-          <w:rFonts w:ascii="Helvetica Neue" w:hAnsi="Helvetica Neue" w:eastAsia="Helvetica Neue"/>
-          <w:color w:val="0C0C0C"/>
-          <w:sz w:val="24"/>
-        </w:rPr>
-        <w:t>•</w:t>
-        <w:tab/>
-      </w:r>
-      <w:r>
-        <w:rPr>
-          <w:rFonts w:ascii="Helvetica Neue" w:hAnsi="Helvetica Neue" w:eastAsia="Helvetica Neue"/>
-          <w:i w:val="0"/>
-          <w:color w:val="0C0C0C"/>
-          <w:sz w:val="24"/>
-        </w:rPr>
-        <w:t>Built self-service recruiting flows for authentication, job creation, bulk uploads, candidate review, match lists, and shortlist export.</w:t>
-      </w:r>
-    </w:p>
-    <w:p>
-      <w:pPr>
-        <w:pStyle w:val="ListBullet"/>
-        <w:keepLines/>
-        <w:numPr>
-          <w:numId w:val="0"/>
-        </w:numPr>
-        <w:tabs>
-          <w:tab w:pos="360" w:val="left"/>
-        </w:tabs>
-        <w:spacing w:before="0" w:after="160"/>
-        <w:ind w:left="360" w:hanging="360"/>
-      </w:pPr>
-      <w:r>
-        <w:rPr>
-          <w:rFonts w:ascii="Helvetica Neue" w:hAnsi="Helvetica Neue" w:eastAsia="Helvetica Neue"/>
-          <w:color w:val="0C0C0C"/>
-          <w:sz w:val="24"/>
-        </w:rPr>
-        <w:t>•</w:t>
-        <w:tab/>
-      </w:r>
-      <w:r>
-        <w:rPr>
-          <w:rFonts w:ascii="Helvetica Neue" w:hAnsi="Helvetica Neue" w:eastAsia="Helvetica Neue"/>
-          <w:i w:val="0"/>
-          <w:color w:val="0C0C0C"/>
-          <w:sz w:val="24"/>
-        </w:rPr>
-        <w:t>Built a Django and Celery pipeline that extracted candidate data with OpenAI APIs and stored embedding vectors in Pinecone.</w:t>
-      </w:r>
-    </w:p>
-    <w:p>
-      <w:pPr>
-        <w:pStyle w:val="ListBullet"/>
-        <w:keepLines/>
-        <w:numPr>
-          <w:numId w:val="0"/>
-        </w:numPr>
-        <w:tabs>
-          <w:tab w:pos="360" w:val="left"/>
-        </w:tabs>
-        <w:spacing w:before="0" w:after="160"/>
-        <w:ind w:left="360" w:hanging="360"/>
-      </w:pPr>
-      <w:r>
-        <w:rPr>
-          <w:rFonts w:ascii="Helvetica Neue" w:hAnsi="Helvetica Neue" w:eastAsia="Helvetica Neue"/>
-          <w:color w:val="0C0C0C"/>
-          <w:sz w:val="24"/>
-        </w:rPr>
-        <w:t>•</w:t>
-        <w:tab/>
-      </w:r>
-      <w:r>
-        <w:rPr>
-          <w:rFonts w:ascii="Helvetica Neue" w:hAnsi="Helvetica Neue" w:eastAsia="Helvetica Neue"/>
-          <w:i w:val="0"/>
-          <w:color w:val="0C0C0C"/>
-          <w:sz w:val="24"/>
-        </w:rPr>
-        <w:t>Designed RAG and semantic matching across skills, experience, career direction, qualifications, and holistic fit.</w:t>
-      </w:r>
-    </w:p>
-    <w:p>
-      <w:pPr>
-        <w:pStyle w:val="ListBullet"/>
-        <w:keepLines/>
-        <w:numPr>
-          <w:numId w:val="0"/>
-        </w:numPr>
-        <w:tabs>
-          <w:tab w:pos="360" w:val="left"/>
-        </w:tabs>
-        <w:spacing w:before="0" w:after="160"/>
-        <w:ind w:left="360" w:hanging="360"/>
-      </w:pPr>
-      <w:r>
-        <w:rPr>
-          <w:rFonts w:ascii="Helvetica Neue" w:hAnsi="Helvetica Neue" w:eastAsia="Helvetica Neue"/>
-          <w:color w:val="0C0C0C"/>
-          <w:sz w:val="24"/>
-        </w:rPr>
-        <w:t>•</w:t>
-        <w:tab/>
-      </w:r>
-      <w:r>
-        <w:rPr>
-          <w:rFonts w:ascii="Helvetica Neue" w:hAnsi="Helvetica Neue" w:eastAsia="Helvetica Neue"/>
-          <w:i w:val="0"/>
-          <w:color w:val="0C0C0C"/>
-          <w:sz w:val="24"/>
-        </w:rPr>
-        <w:t>Implemented holistic, skills, experience, wildcard, and qualifications matching lenses with Pinecone namespaces.</w:t>
-      </w:r>
-    </w:p>
-    <w:p>
-      <w:pPr>
-        <w:pStyle w:val="ListBullet"/>
-        <w:keepLines/>
-        <w:numPr>
-          <w:numId w:val="0"/>
-        </w:numPr>
-        <w:tabs>
-          <w:tab w:pos="360" w:val="left"/>
-        </w:tabs>
-        <w:spacing w:before="0" w:after="160"/>
-        <w:ind w:left="360" w:hanging="360"/>
-      </w:pPr>
-      <w:r>
-        <w:rPr>
-          <w:rFonts w:ascii="Helvetica Neue" w:hAnsi="Helvetica Neue" w:eastAsia="Helvetica Neue"/>
-          <w:color w:val="0C0C0C"/>
-          <w:sz w:val="24"/>
-        </w:rPr>
-        <w:t>•</w:t>
-        <w:tab/>
-      </w:r>
-      <w:r>
-        <w:rPr>
-          <w:rFonts w:ascii="Helvetica Neue" w:hAnsi="Helvetica Neue" w:eastAsia="Helvetica Neue"/>
-          <w:i w:val="0"/>
-          <w:color w:val="0C0C0C"/>
-          <w:sz w:val="24"/>
-        </w:rPr>
-        <w:t>Built pay-as-you-go monetization with free credits, Stripe Checkout, recruiter balances, and premium-action credit deduction.</w:t>
-      </w:r>
-    </w:p>
-    <w:p>
-      <w:pPr>
-        <w:pStyle w:val="ListBullet"/>
-        <w:keepLines/>
-        <w:numPr>
-          <w:numId w:val="0"/>
-        </w:numPr>
-        <w:tabs>
-          <w:tab w:pos="360" w:val="left"/>
-        </w:tabs>
-        <w:spacing w:before="0" w:after="160"/>
-        <w:ind w:left="360" w:hanging="360"/>
-      </w:pPr>
-      <w:r>
-        <w:rPr>
-          <w:rFonts w:ascii="Helvetica Neue" w:hAnsi="Helvetica Neue" w:eastAsia="Helvetica Neue"/>
-          <w:color w:val="0C0C0C"/>
-          <w:sz w:val="24"/>
-        </w:rPr>
-        <w:t>•</w:t>
-        <w:tab/>
-      </w:r>
-      <w:r>
-        <w:rPr>
-          <w:rFonts w:ascii="Helvetica Neue" w:hAnsi="Helvetica Neue" w:eastAsia="Helvetica Neue"/>
-          <w:i w:val="0"/>
-          <w:color w:val="0C0C0C"/>
-          <w:sz w:val="24"/>
-        </w:rPr>
-        <w:t>Built HTMX polling interfaces for long-running jobs, task status, and per-owner asynchronous work visibility.</w:t>
-      </w:r>
-    </w:p>
-    <w:p>
-      <w:pPr>
-        <w:pStyle w:val="ListBullet"/>
-        <w:keepLines/>
-        <w:numPr>
-          <w:numId w:val="0"/>
-        </w:numPr>
-        <w:tabs>
-          <w:tab w:pos="360" w:val="left"/>
-        </w:tabs>
-        <w:spacing w:before="0" w:after="160"/>
-        <w:ind w:left="360" w:hanging="360"/>
-      </w:pPr>
-      <w:r>
-        <w:rPr>
-          <w:rFonts w:ascii="Helvetica Neue" w:hAnsi="Helvetica Neue" w:eastAsia="Helvetica Neue"/>
-          <w:color w:val="0C0C0C"/>
-          <w:sz w:val="24"/>
-        </w:rPr>
-        <w:t>•</w:t>
-        <w:tab/>
-      </w:r>
-      <w:r>
-        <w:rPr>
-          <w:rFonts w:ascii="Helvetica Neue" w:hAnsi="Helvetica Neue" w:eastAsia="Helvetica Neue"/>
-          <w:i w:val="0"/>
-          <w:color w:val="0C0C0C"/>
-          <w:sz w:val="24"/>
-        </w:rPr>
-        <w:t>Deployed hosted data, Celery workers, queued email, S3-style storage, and production settings on Sevalla.</w:t>
-      </w:r>
-    </w:p>
-    <w:p>
-      <w:pPr>
-        <w:pStyle w:val="ListBullet"/>
-        <w:keepLines/>
-        <w:numPr>
-          <w:numId w:val="0"/>
-        </w:numPr>
-        <w:tabs>
-          <w:tab w:pos="360" w:val="left"/>
-        </w:tabs>
-        <w:spacing w:before="0" w:after="160"/>
-        <w:ind w:left="360" w:hanging="360"/>
-      </w:pPr>
-      <w:r>
-        <w:rPr>
-          <w:rFonts w:ascii="Helvetica Neue" w:hAnsi="Helvetica Neue" w:eastAsia="Helvetica Neue"/>
-          <w:color w:val="0C0C0C"/>
-          <w:sz w:val="24"/>
-        </w:rPr>
-        <w:t>•</w:t>
-        <w:tab/>
-      </w:r>
-      <w:r>
-        <w:rPr>
-          <w:rFonts w:ascii="Helvetica Neue" w:hAnsi="Helvetica Neue" w:eastAsia="Helvetica Neue"/>
-          <w:i w:val="0"/>
-          <w:color w:val="0C0C0C"/>
-          <w:sz w:val="24"/>
-        </w:rPr>
-        <w:t>Created positioning, landing-page messaging, demos, video concepts, and recruiter-focused campaign materials.</w:t>
-      </w:r>
-    </w:p>
-    <w:p>
-      <w:pPr>
-        <w:pStyle w:val="ListBullet"/>
-        <w:keepLines/>
-        <w:numPr>
-          <w:numId w:val="0"/>
-        </w:numPr>
-        <w:tabs>
-          <w:tab w:pos="360" w:val="left"/>
-        </w:tabs>
-        <w:spacing w:before="0" w:after="160"/>
-        <w:ind w:left="360" w:hanging="360"/>
-      </w:pPr>
-      <w:r>
-        <w:rPr>
-          <w:rFonts w:ascii="Helvetica Neue" w:hAnsi="Helvetica Neue" w:eastAsia="Helvetica Neue"/>
-          <w:color w:val="0C0C0C"/>
-          <w:sz w:val="24"/>
-        </w:rPr>
-        <w:t>•</w:t>
-        <w:tab/>
-      </w:r>
-      <w:r>
-        <w:rPr>
-          <w:rFonts w:ascii="Helvetica Neue" w:hAnsi="Helvetica Neue" w:eastAsia="Helvetica Neue"/>
-          <w:i w:val="0"/>
-          <w:color w:val="0C0C0C"/>
-          <w:sz w:val="24"/>
-        </w:rPr>
-        <w:t>Added guardrail checks and corrective loops for resume parsing and candidate extraction quality.</w:t>
-      </w:r>
-    </w:p>
-    <w:p>
-      <w:pPr>
-        <w:pStyle w:val="ListBullet"/>
-        <w:keepLines/>
-        <w:numPr>
-          <w:numId w:val="0"/>
-        </w:numPr>
-        <w:tabs>
-          <w:tab w:pos="360" w:val="left"/>
-        </w:tabs>
-        <w:spacing w:before="0" w:after="160"/>
-        <w:ind w:left="360" w:hanging="360"/>
-      </w:pPr>
-      <w:r>
-        <w:rPr>
-          <w:rFonts w:ascii="Helvetica Neue" w:hAnsi="Helvetica Neue" w:eastAsia="Helvetica Neue"/>
-          <w:color w:val="0C0C0C"/>
-          <w:sz w:val="24"/>
-        </w:rPr>
-        <w:t>•</w:t>
-        <w:tab/>
-      </w:r>
-      <w:r>
-        <w:rPr>
-          <w:rFonts w:ascii="Helvetica Neue" w:hAnsi="Helvetica Neue" w:eastAsia="Helvetica Neue"/>
-          <w:i w:val="0"/>
-          <w:color w:val="0C0C0C"/>
-          <w:sz w:val="24"/>
-        </w:rPr>
-        <w:t>Owned product strategy, architecture, full-stack implementation, UX, deployment, pricing, and live-market validation.</w:t>
-      </w:r>
-    </w:p>
-    <w:p>
-      <w:pPr>
-        <w:keepNext/>
-        <w:spacing w:before="320" w:after="160"/>
-      </w:pPr>
-      <w:r>
-        <w:rPr>
-          <w:rFonts w:ascii="Helvetica Neue" w:hAnsi="Helvetica Neue" w:eastAsia="Helvetica Neue"/>
-          <w:b/>
-          <w:color w:val="0C0C0C"/>
-          <w:sz w:val="32"/>
-        </w:rPr>
-        <w:t>Selected Open Source AI Work</w:t>
+        <w:t>Built and deployed independent AI applications with structured extraction, semantic matching, background processing, and subscription billing.</w:t>
       </w:r>
     </w:p>
     <w:p>
@@ -2697,7 +1978,7 @@
           <w:color w:val="0C0C0C"/>
           <w:sz w:val="24"/>
         </w:rPr>
-        <w:t xml:space="preserve"> Framework Design, API Design, Platform Design, AI Product Architecture, Reference Implementations, Technical Strategy, UI/UX Design, Developer Experience, Cross-Functional Leadership, Mentorship</w:t>
+        <w:t xml:space="preserve"> Framework Design, API Design, Platform Design, AI Product Architecture, Reference Implementations, Background Processing, Subscription Billing, Technical Strategy, UI/UX Design, Developer Experience, Cross-Functional Leadership, Mentorship</w:t>
       </w:r>
     </w:p>
     <w:p>

</xml_diff>

<commit_message>
Add ManageAI principal engineering experience to resume
</commit_message>
<xml_diff>
--- a/docs/downloads/bt-franklin-resume-full.docx
+++ b/docs/downloads/bt-franklin-resume-full.docx
@@ -106,7 +106,7 @@
           <w:color w:val="0C0C0C"/>
           <w:sz w:val="24"/>
         </w:rPr>
-        <w:t>Applied AI technical lead and software architect with 20+ years building enterprise software, developer tools, and product-facing systems. Combines hands-on agentic AI, platform architecture, full-stack engineering, product judgment, and published computational creativity research.</w:t>
+        <w:t>Principal engineer and software architect with 20+ years building enterprise software, developer tools, and product-facing systems. Combines hands-on agentic AI, platform architecture, full-stack engineering, product judgment, and published computational creativity research.</w:t>
       </w:r>
     </w:p>
     <w:p>
@@ -122,6 +122,240 @@
           <w:sz w:val="32"/>
         </w:rPr>
         <w:t>Professional Experience</w:t>
+      </w:r>
+    </w:p>
+    <w:p>
+      <w:pPr>
+        <w:keepNext/>
+        <w:spacing w:before="0" w:after="160"/>
+      </w:pPr>
+      <w:r>
+        <w:rPr>
+          <w:rFonts w:ascii="Helvetica Neue" w:hAnsi="Helvetica Neue" w:eastAsia="Helvetica Neue"/>
+          <w:b/>
+          <w:color w:val="0C0C0C"/>
+          <w:sz w:val="24"/>
+        </w:rPr>
+        <w:t>ManageAI</w:t>
+      </w:r>
+    </w:p>
+    <w:p>
+      <w:pPr>
+        <w:keepNext/>
+        <w:spacing w:before="0" w:after="160"/>
+      </w:pPr>
+      <w:r>
+        <w:rPr>
+          <w:rFonts w:ascii="Helvetica Neue" w:hAnsi="Helvetica Neue" w:eastAsia="Helvetica Neue"/>
+          <w:i/>
+          <w:color w:val="0C0C0C"/>
+          <w:sz w:val="24"/>
+        </w:rPr>
+        <w:t>Founding Principal Engineer</w:t>
+      </w:r>
+      <w:r>
+        <w:br/>
+      </w:r>
+      <w:r>
+        <w:rPr>
+          <w:rFonts w:ascii="Helvetica Neue" w:hAnsi="Helvetica Neue" w:eastAsia="Helvetica Neue"/>
+          <w:i/>
+          <w:color w:val="0C0C0C"/>
+          <w:sz w:val="24"/>
+        </w:rPr>
+        <w:t>February 2026 - Present</w:t>
+      </w:r>
+    </w:p>
+    <w:p>
+      <w:pPr>
+        <w:pStyle w:val="ListBullet"/>
+        <w:keepLines/>
+        <w:numPr>
+          <w:numId w:val="0"/>
+        </w:numPr>
+        <w:tabs>
+          <w:tab w:pos="360" w:val="left"/>
+        </w:tabs>
+        <w:spacing w:before="0" w:after="160"/>
+        <w:ind w:left="360" w:hanging="360"/>
+      </w:pPr>
+      <w:r>
+        <w:rPr>
+          <w:rFonts w:ascii="Helvetica Neue" w:hAnsi="Helvetica Neue" w:eastAsia="Helvetica Neue"/>
+          <w:color w:val="0C0C0C"/>
+          <w:sz w:val="24"/>
+        </w:rPr>
+        <w:t>•</w:t>
+        <w:tab/>
+      </w:r>
+      <w:r>
+        <w:rPr>
+          <w:rFonts w:ascii="Helvetica Neue" w:hAnsi="Helvetica Neue" w:eastAsia="Helvetica Neue"/>
+          <w:i w:val="0"/>
+          <w:color w:val="0C0C0C"/>
+          <w:sz w:val="24"/>
+        </w:rPr>
+        <w:t>Use an AI-first approach for all engineering work, directing coding agents and agentic workflows to build applications, services, and complex AWS infrastructure.</w:t>
+      </w:r>
+    </w:p>
+    <w:p>
+      <w:pPr>
+        <w:pStyle w:val="ListBullet"/>
+        <w:keepLines/>
+        <w:numPr>
+          <w:numId w:val="0"/>
+        </w:numPr>
+        <w:tabs>
+          <w:tab w:pos="360" w:val="left"/>
+        </w:tabs>
+        <w:spacing w:before="0" w:after="160"/>
+        <w:ind w:left="360" w:hanging="360"/>
+      </w:pPr>
+      <w:r>
+        <w:rPr>
+          <w:rFonts w:ascii="Helvetica Neue" w:hAnsi="Helvetica Neue" w:eastAsia="Helvetica Neue"/>
+          <w:color w:val="0C0C0C"/>
+          <w:sz w:val="24"/>
+        </w:rPr>
+        <w:t>•</w:t>
+        <w:tab/>
+      </w:r>
+      <w:r>
+        <w:rPr>
+          <w:rFonts w:ascii="Helvetica Neue" w:hAnsi="Helvetica Neue" w:eastAsia="Helvetica Neue"/>
+          <w:i w:val="0"/>
+          <w:color w:val="0C0C0C"/>
+          <w:sz w:val="24"/>
+        </w:rPr>
+        <w:t>Built Workforce Management with Django, PostgreSQL, and HTMX for customer-owned AI workforces, covering opportunities, deployments, evaluation evidence, performance reviews, and governance.</w:t>
+      </w:r>
+    </w:p>
+    <w:p>
+      <w:pPr>
+        <w:pStyle w:val="ListBullet"/>
+        <w:keepLines/>
+        <w:numPr>
+          <w:numId w:val="0"/>
+        </w:numPr>
+        <w:tabs>
+          <w:tab w:pos="360" w:val="left"/>
+        </w:tabs>
+        <w:spacing w:before="0" w:after="160"/>
+        <w:ind w:left="360" w:hanging="360"/>
+      </w:pPr>
+      <w:r>
+        <w:rPr>
+          <w:rFonts w:ascii="Helvetica Neue" w:hAnsi="Helvetica Neue" w:eastAsia="Helvetica Neue"/>
+          <w:color w:val="0C0C0C"/>
+          <w:sz w:val="24"/>
+        </w:rPr>
+        <w:t>•</w:t>
+        <w:tab/>
+      </w:r>
+      <w:r>
+        <w:rPr>
+          <w:rFonts w:ascii="Helvetica Neue" w:hAnsi="Helvetica Neue" w:eastAsia="Helvetica Neue"/>
+          <w:i w:val="0"/>
+          <w:color w:val="0C0C0C"/>
+          <w:sz w:val="24"/>
+        </w:rPr>
+        <w:t>Designed tenant-scoped APIs with authenticated customer isolation, capability-based access, idempotent commands, optimistic concurrency, and audit history.</w:t>
+      </w:r>
+    </w:p>
+    <w:p>
+      <w:pPr>
+        <w:pStyle w:val="ListBullet"/>
+        <w:keepLines/>
+        <w:numPr>
+          <w:numId w:val="0"/>
+        </w:numPr>
+        <w:tabs>
+          <w:tab w:pos="360" w:val="left"/>
+        </w:tabs>
+        <w:spacing w:before="0" w:after="160"/>
+        <w:ind w:left="360" w:hanging="360"/>
+      </w:pPr>
+      <w:r>
+        <w:rPr>
+          <w:rFonts w:ascii="Helvetica Neue" w:hAnsi="Helvetica Neue" w:eastAsia="Helvetica Neue"/>
+          <w:color w:val="0C0C0C"/>
+          <w:sz w:val="24"/>
+        </w:rPr>
+        <w:t>•</w:t>
+        <w:tab/>
+      </w:r>
+      <w:r>
+        <w:rPr>
+          <w:rFonts w:ascii="Helvetica Neue" w:hAnsi="Helvetica Neue" w:eastAsia="Helvetica Neue"/>
+          <w:i w:val="0"/>
+          <w:color w:val="0C0C0C"/>
+          <w:sz w:val="24"/>
+        </w:rPr>
+        <w:t>Built Knowledge services with shared HTTP and MCP application rules, immutable document revisions, human approval, and controlled publication.</w:t>
+      </w:r>
+    </w:p>
+    <w:p>
+      <w:pPr>
+        <w:pStyle w:val="ListBullet"/>
+        <w:keepLines/>
+        <w:numPr>
+          <w:numId w:val="0"/>
+        </w:numPr>
+        <w:tabs>
+          <w:tab w:pos="360" w:val="left"/>
+        </w:tabs>
+        <w:spacing w:before="0" w:after="160"/>
+        <w:ind w:left="360" w:hanging="360"/>
+      </w:pPr>
+      <w:r>
+        <w:rPr>
+          <w:rFonts w:ascii="Helvetica Neue" w:hAnsi="Helvetica Neue" w:eastAsia="Helvetica Neue"/>
+          <w:color w:val="0C0C0C"/>
+          <w:sz w:val="24"/>
+        </w:rPr>
+        <w:t>•</w:t>
+        <w:tab/>
+      </w:r>
+      <w:r>
+        <w:rPr>
+          <w:rFonts w:ascii="Helvetica Neue" w:hAnsi="Helvetica Neue" w:eastAsia="Helvetica Neue"/>
+          <w:i w:val="0"/>
+          <w:color w:val="0C0C0C"/>
+          <w:sz w:val="24"/>
+        </w:rPr>
+        <w:t>Replaced repository-based agent record writes with governed API publishers, durable intent ledgers, safe retries, and verification of stored results.</w:t>
+      </w:r>
+    </w:p>
+    <w:p>
+      <w:pPr>
+        <w:pStyle w:val="ListBullet"/>
+        <w:keepLines/>
+        <w:numPr>
+          <w:numId w:val="0"/>
+        </w:numPr>
+        <w:tabs>
+          <w:tab w:pos="360" w:val="left"/>
+        </w:tabs>
+        <w:spacing w:before="0" w:after="160"/>
+        <w:ind w:left="360" w:hanging="360"/>
+      </w:pPr>
+      <w:r>
+        <w:rPr>
+          <w:rFonts w:ascii="Helvetica Neue" w:hAnsi="Helvetica Neue" w:eastAsia="Helvetica Neue"/>
+          <w:color w:val="0C0C0C"/>
+          <w:sz w:val="24"/>
+        </w:rPr>
+        <w:t>•</w:t>
+        <w:tab/>
+      </w:r>
+      <w:r>
+        <w:rPr>
+          <w:rFonts w:ascii="Helvetica Neue" w:hAnsi="Helvetica Neue" w:eastAsia="Helvetica Neue"/>
+          <w:i w:val="0"/>
+          <w:color w:val="0C0C0C"/>
+          <w:sz w:val="24"/>
+        </w:rPr>
+        <w:t>Built customer-specific AWS deployments with Terraform, ECS Fargate, and RDS, including guarded data transfers, staging refresh, migration checks, and rollback safeguards.</w:t>
       </w:r>
     </w:p>
     <w:p>
@@ -1930,7 +2164,7 @@
           <w:color w:val="0C0C0C"/>
           <w:sz w:val="24"/>
         </w:rPr>
-        <w:t xml:space="preserve"> REST APIs, Django, Celery, HTMX, Pydantic, PydanticAI, OpenAI Agents SDK, Docker, PostgreSQL, SQLite, AWS Services, AWS QuickSight, Amazon Q, Strands Agents SDK, GitHub Actions, Terraform, React, Next.js, Node.js, Tailwind CSS, Salesforce Lightning, Lightning Web Components, oclif</w:t>
+        <w:t xml:space="preserve"> REST APIs, Django, Celery, HTMX, Pydantic, PydanticAI, OpenAI Agents SDK, Docker, PostgreSQL, SQLite, Django Ninja, AWS Services, ECS Fargate, RDS, Cognito, DynamoDB, S3, AWS QuickSight, Amazon Q, Strands Agents SDK, GitHub Actions, Terraform, React, Next.js, Node.js, Tailwind CSS, Salesforce Lightning, Lightning Web Components, oclif</w:t>
       </w:r>
     </w:p>
     <w:p>
@@ -1978,7 +2212,7 @@
           <w:color w:val="0C0C0C"/>
           <w:sz w:val="24"/>
         </w:rPr>
-        <w:t xml:space="preserve"> Framework Design, API Design, Platform Design, AI Product Architecture, Reference Implementations, Background Processing, Subscription Billing, Technical Strategy, UI/UX Design, Developer Experience, Cross-Functional Leadership, Mentorship</w:t>
+        <w:t xml:space="preserve"> Framework Design, API Design, Platform Design, AI Product Architecture, Reference Implementations, Multi-Tenant Architecture, AI Governance, Background Processing, Subscription Billing, Technical Strategy, UI/UX Design, Developer Experience, Cross-Functional Leadership, Mentorship</w:t>
       </w:r>
     </w:p>
     <w:p>

</xml_diff>